<commit_message>
knit of W1 and W1.1
</commit_message>
<xml_diff>
--- a/Workshops/Workshop 1 - Hidden assumptions/W1.1.docx
+++ b/Workshops/Workshop 1 - Hidden assumptions/W1.1.docx
@@ -23,7 +23,7 @@
         <w:pStyle w:val="Date"/>
       </w:pPr>
       <w:r>
-        <w:t>Last updated: 2024-08-14</w:t>
+        <w:t>Last updated: 2024-09-05</w:t>
       </w:r>
     </w:p>
     <w:sdt>
@@ -34,7 +34,7 @@
           <w:sz w:val="22"/>
           <w:szCs w:val="24"/>
         </w:rPr>
-        <w:id w:val="975192184"/>
+        <w:id w:val="1212152781"/>
         <w:docPartObj>
           <w:docPartGallery w:val="Table of Contents"/>
           <w:docPartUnique/>
@@ -73,7 +73,7 @@
           <w:r>
             <w:fldChar w:fldCharType="separate"/>
           </w:r>
-          <w:hyperlink w:anchor="_Toc174535087" w:history="1">
+          <w:hyperlink w:anchor="_Toc176443337" w:history="1">
             <w:r>
               <w:rPr>
                 <w:rStyle w:val="Hyperlink"/>
@@ -100,7 +100,7 @@
                 <w:noProof/>
                 <w:webHidden/>
               </w:rPr>
-              <w:instrText xml:space="preserve"> PAGEREF _Toc174535087 \h </w:instrText>
+              <w:instrText xml:space="preserve"> PAGEREF _Toc176443337 \h </w:instrText>
             </w:r>
             <w:r>
               <w:rPr>
@@ -146,7 +146,7 @@
               <w14:ligatures w14:val="standardContextual"/>
             </w:rPr>
           </w:pPr>
-          <w:hyperlink w:anchor="_Toc174535088" w:history="1">
+          <w:hyperlink w:anchor="_Toc176443338" w:history="1">
             <w:r>
               <w:rPr>
                 <w:rStyle w:val="Hyperlink"/>
@@ -173,7 +173,7 @@
                 <w:noProof/>
                 <w:webHidden/>
               </w:rPr>
-              <w:instrText xml:space="preserve"> PAGEREF _Toc174535088 \h </w:instrText>
+              <w:instrText xml:space="preserve"> PAGEREF _Toc176443338 \h </w:instrText>
             </w:r>
             <w:r>
               <w:rPr>
@@ -219,7 +219,7 @@
               <w14:ligatures w14:val="standardContextual"/>
             </w:rPr>
           </w:pPr>
-          <w:hyperlink w:anchor="_Toc174535089" w:history="1">
+          <w:hyperlink w:anchor="_Toc176443339" w:history="1">
             <w:r>
               <w:rPr>
                 <w:rStyle w:val="Hyperlink"/>
@@ -246,7 +246,7 @@
                 <w:noProof/>
                 <w:webHidden/>
               </w:rPr>
-              <w:instrText xml:space="preserve"> PAGEREF _Toc174535089 \h </w:instrText>
+              <w:instrText xml:space="preserve"> PAGEREF _Toc176443339 \h </w:instrText>
             </w:r>
             <w:r>
               <w:rPr>
@@ -292,7 +292,7 @@
               <w14:ligatures w14:val="standardContextual"/>
             </w:rPr>
           </w:pPr>
-          <w:hyperlink w:anchor="_Toc174535090" w:history="1">
+          <w:hyperlink w:anchor="_Toc176443340" w:history="1">
             <w:r>
               <w:rPr>
                 <w:rStyle w:val="Hyperlink"/>
@@ -319,7 +319,7 @@
                 <w:noProof/>
                 <w:webHidden/>
               </w:rPr>
-              <w:instrText xml:space="preserve"> PAGEREF _Toc174535090 \h </w:instrText>
+              <w:instrText xml:space="preserve"> PAGEREF _Toc176443340 \h </w:instrText>
             </w:r>
             <w:r>
               <w:rPr>
@@ -365,7 +365,7 @@
               <w14:ligatures w14:val="standardContextual"/>
             </w:rPr>
           </w:pPr>
-          <w:hyperlink w:anchor="_Toc174535091" w:history="1">
+          <w:hyperlink w:anchor="_Toc176443341" w:history="1">
             <w:r>
               <w:rPr>
                 <w:rStyle w:val="Hyperlink"/>
@@ -392,7 +392,7 @@
                 <w:noProof/>
                 <w:webHidden/>
               </w:rPr>
-              <w:instrText xml:space="preserve"> PAGEREF _Toc174535091 \h </w:instrText>
+              <w:instrText xml:space="preserve"> PAGEREF _Toc176443341 \h </w:instrText>
             </w:r>
             <w:r>
               <w:rPr>
@@ -438,7 +438,7 @@
               <w14:ligatures w14:val="standardContextual"/>
             </w:rPr>
           </w:pPr>
-          <w:hyperlink w:anchor="_Toc174535092" w:history="1">
+          <w:hyperlink w:anchor="_Toc176443342" w:history="1">
             <w:r>
               <w:rPr>
                 <w:rStyle w:val="Hyperlink"/>
@@ -465,7 +465,7 @@
                 <w:noProof/>
                 <w:webHidden/>
               </w:rPr>
-              <w:instrText xml:space="preserve"> PAGEREF _Toc174535092 \h </w:instrText>
+              <w:instrText xml:space="preserve"> PAGEREF _Toc176443342 \h </w:instrText>
             </w:r>
             <w:r>
               <w:rPr>
@@ -511,7 +511,7 @@
               <w14:ligatures w14:val="standardContextual"/>
             </w:rPr>
           </w:pPr>
-          <w:hyperlink w:anchor="_Toc174535093" w:history="1">
+          <w:hyperlink w:anchor="_Toc176443343" w:history="1">
             <w:r>
               <w:rPr>
                 <w:rStyle w:val="Hyperlink"/>
@@ -538,7 +538,7 @@
                 <w:noProof/>
                 <w:webHidden/>
               </w:rPr>
-              <w:instrText xml:space="preserve"> PAGEREF _Toc174535093 \h </w:instrText>
+              <w:instrText xml:space="preserve"> PAGEREF _Toc176443343 \h </w:instrText>
             </w:r>
             <w:r>
               <w:rPr>
@@ -584,7 +584,7 @@
               <w14:ligatures w14:val="standardContextual"/>
             </w:rPr>
           </w:pPr>
-          <w:hyperlink w:anchor="_Toc174535094" w:history="1">
+          <w:hyperlink w:anchor="_Toc176443344" w:history="1">
             <w:r>
               <w:rPr>
                 <w:rStyle w:val="Hyperlink"/>
@@ -611,7 +611,7 @@
                 <w:noProof/>
                 <w:webHidden/>
               </w:rPr>
-              <w:instrText xml:space="preserve"> PAGEREF _Toc174535094 \h </w:instrText>
+              <w:instrText xml:space="preserve"> PAGEREF _Toc176443344 \h </w:instrText>
             </w:r>
             <w:r>
               <w:rPr>
@@ -654,7 +654,7 @@
         <w:pStyle w:val="Heading1"/>
       </w:pPr>
       <w:bookmarkStart w:id="0" w:name="workshop-structure"/>
-      <w:bookmarkStart w:id="1" w:name="_Toc174535087"/>
+      <w:bookmarkStart w:id="1" w:name="_Toc176443337"/>
       <w:r>
         <w:t>Workshop Structure</w:t>
       </w:r>
@@ -757,7 +757,7 @@
         <w:pStyle w:val="Heading1"/>
       </w:pPr>
       <w:bookmarkStart w:id="2" w:name="learning-objectives"/>
-      <w:bookmarkStart w:id="3" w:name="_Toc174535088"/>
+      <w:bookmarkStart w:id="3" w:name="_Toc176443338"/>
       <w:bookmarkEnd w:id="0"/>
       <w:r>
         <w:t>Learning Objectives</w:t>
@@ -822,7 +822,7 @@
         <w:pStyle w:val="Heading1"/>
       </w:pPr>
       <w:bookmarkStart w:id="4" w:name="task-1"/>
-      <w:bookmarkStart w:id="5" w:name="_Toc174535089"/>
+      <w:bookmarkStart w:id="5" w:name="_Toc176443339"/>
       <w:bookmarkEnd w:id="2"/>
       <w:r>
         <w:lastRenderedPageBreak/>
@@ -1540,7 +1540,7 @@
         <w:pStyle w:val="Heading1"/>
       </w:pPr>
       <w:bookmarkStart w:id="6" w:name="task-2"/>
-      <w:bookmarkStart w:id="7" w:name="_Toc174535090"/>
+      <w:bookmarkStart w:id="7" w:name="_Toc176443340"/>
       <w:bookmarkEnd w:id="4"/>
       <w:r>
         <w:t>Task 2</w:t>
@@ -1571,7 +1571,7 @@
         <w:pStyle w:val="Heading2"/>
       </w:pPr>
       <w:bookmarkStart w:id="8" w:name="question-set-one"/>
-      <w:bookmarkStart w:id="9" w:name="_Toc174535091"/>
+      <w:bookmarkStart w:id="9" w:name="_Toc176443341"/>
       <w:r>
         <w:t>Question Set One</w:t>
       </w:r>
@@ -1624,7 +1624,7 @@
         <w:pStyle w:val="Heading2"/>
       </w:pPr>
       <w:bookmarkStart w:id="10" w:name="question-set-two"/>
-      <w:bookmarkStart w:id="11" w:name="_Toc174535092"/>
+      <w:bookmarkStart w:id="11" w:name="_Toc176443342"/>
       <w:bookmarkEnd w:id="8"/>
       <w:r>
         <w:t>Question Set Two</w:t>
@@ -1669,7 +1669,7 @@
         <w:pStyle w:val="Heading1"/>
       </w:pPr>
       <w:bookmarkStart w:id="12" w:name="task-3"/>
-      <w:bookmarkStart w:id="13" w:name="_Toc174535093"/>
+      <w:bookmarkStart w:id="13" w:name="_Toc176443343"/>
       <w:bookmarkEnd w:id="6"/>
       <w:bookmarkEnd w:id="10"/>
       <w:r>
@@ -1701,7 +1701,7 @@
         <w:t>how</w:t>
       </w:r>
       <w:r>
-        <w:t xml:space="preserve"> the data was collected, so gauging how likely it was to meet or violate assumptions is difficult (but not impossible). To allow you to do so now, here is a description of data collection:</w:t>
+        <w:t xml:space="preserve"> the data were collected, so gauging how likely it was to meet or violate assumptions is difficult (but not impossible). To allow you to do so now, here is a description of data collection:</w:t>
       </w:r>
     </w:p>
     <w:p>
@@ -1729,7 +1729,7 @@
         <w:pStyle w:val="Heading2"/>
       </w:pPr>
       <w:bookmarkStart w:id="14" w:name="question-set-three"/>
-      <w:bookmarkStart w:id="15" w:name="_Toc174535094"/>
+      <w:bookmarkStart w:id="15" w:name="_Toc176443344"/>
       <w:r>
         <w:t>Question Set Three</w:t>
       </w:r>
@@ -1754,7 +1754,7 @@
         </w:numPr>
       </w:pPr>
       <w:r>
-        <w:t>Describe how to data collection could have been improved on such that the assumptions would be more likely to be met.</w:t>
+        <w:t>Describe how the data collection could have been improved on such that the assumptions would be more likely to be met.</w:t>
       </w:r>
       <w:bookmarkEnd w:id="12"/>
       <w:bookmarkEnd w:id="14"/>
@@ -2090,10 +2090,10 @@
       <w:startOverride w:val="1"/>
     </w:lvlOverride>
   </w:num>
-  <w:num w:numId="4" w16cid:durableId="263073799">
+  <w:num w:numId="4" w16cid:durableId="1665352949">
     <w:abstractNumId w:val="0"/>
   </w:num>
-  <w:num w:numId="5" w16cid:durableId="1943106293">
+  <w:num w:numId="5" w16cid:durableId="1852640662">
     <w:abstractNumId w:val="2"/>
     <w:lvlOverride w:ilvl="0">
       <w:startOverride w:val="1"/>
@@ -2123,7 +2123,7 @@
       <w:startOverride w:val="1"/>
     </w:lvlOverride>
   </w:num>
-  <w:num w:numId="6" w16cid:durableId="1502088015">
+  <w:num w:numId="6" w16cid:durableId="147595993">
     <w:abstractNumId w:val="2"/>
     <w:lvlOverride w:ilvl="0">
       <w:startOverride w:val="1"/>
@@ -2153,7 +2153,7 @@
       <w:startOverride w:val="1"/>
     </w:lvlOverride>
   </w:num>
-  <w:num w:numId="7" w16cid:durableId="494957175">
+  <w:num w:numId="7" w16cid:durableId="1603227191">
     <w:abstractNumId w:val="2"/>
     <w:lvlOverride w:ilvl="0">
       <w:startOverride w:val="1"/>
@@ -2183,7 +2183,7 @@
       <w:startOverride w:val="1"/>
     </w:lvlOverride>
   </w:num>
-  <w:num w:numId="8" w16cid:durableId="2110739249">
+  <w:num w:numId="8" w16cid:durableId="1064453610">
     <w:abstractNumId w:val="2"/>
     <w:lvlOverride w:ilvl="0">
       <w:startOverride w:val="1"/>
@@ -2213,7 +2213,7 @@
       <w:startOverride w:val="1"/>
     </w:lvlOverride>
   </w:num>
-  <w:num w:numId="9" w16cid:durableId="1761292251">
+  <w:num w:numId="9" w16cid:durableId="2042171666">
     <w:abstractNumId w:val="2"/>
     <w:lvlOverride w:ilvl="0">
       <w:startOverride w:val="1"/>

</xml_diff>